<commit_message>
Fill affected_product and exploited_by from Rapid7 scan titles and exploit data, extract CPE product info from NVD
Made-with: Cursor
</commit_message>
<xml_diff>
--- a/reports/CTI_Quarterly_Strategic_Brief_2026-04-25.docx
+++ b/reports/CTI_Quarterly_Strategic_Brief_2026-04-25.docx
@@ -65,16 +65,7 @@
           <w:rFonts w:ascii="Arial" w:hAnsi="Arial"/>
           <w:sz w:val="21"/>
         </w:rPr>
-        <w:t>The threat landscape for the genomics, life sciences, and precision manufacturing sectors remained elevated throughout Q1 2026, with 47 publicly disclosed breaches affecting peer organizations in the industry. Estimated aggregate impact exceeded $127M in direct costs and regulatory penalties.</w:t>
-      </w:r>
-    </w:p>
-    <w:p>
-      <w:r>
-        <w:rPr>
-          <w:rFonts w:ascii="Arial" w:hAnsi="Arial"/>
-          <w:sz w:val="21"/>
-        </w:rPr>
-        <w:t>No direct threats to the organization were identified this quarter; however, the threat actors, techniques, and vulnerabilities observed are consistent with those historically used against genomics companies. Nation-state espionage activity, particularly from China-linked actors, showed increased focus on biomanufacturing IP and clinical trial data.</w:t>
+        <w:t>This quarter, the cyber threat landscape for the life sciences, healthcare, biotechnology, and manufacturing sectors remains highly active and increasingly complex. We observed a sustained volume of breach activity, with initial access brokers and extortion groups continuing to target organizations across our industry peer set. Nation state actors from China, Russia, and North Korea remain highly engaged, with a particular focus on intellectual property, research data, and supply chain disruption. Ransomware and extortion attacks continue to be a primary driver of business risk, with criminal groups leveraging both technical vulnerabilities and insider access to maximize impact. The supply chain and third-party ecosystem remains a critical exposure point, as attackers seek to exploit trusted relationships and interconnected systems. Regulatory scrutiny is increasing, particularly around data protection and operational resilience, raising the stakes for compliance and incident response. Peer organizations are investing heavily in security modernization, third-party risk management, and executive awareness initiatives. Failure to keep pace with these industry benchmarks may result in competitive disadvantage, regulatory penalties, and reputational harm.</w:t>
       </w:r>
     </w:p>
     <w:p/>
@@ -227,7 +218,7 @@
                 <w:color w:val="F47F7D"/>
                 <w:sz w:val="16"/>
               </w:rPr>
-              <w:t>vs Q1: +50%</w:t>
+              <w:t>vs Q1: +14%</w:t>
             </w:r>
           </w:p>
         </w:tc>
@@ -273,10 +264,10 @@
               <w:rPr>
                 <w:rFonts w:ascii="Arial" w:hAnsi="Arial"/>
                 <w:b/>
-                <w:color w:val="FFA500"/>
+                <w:color w:val="F47F7D"/>
                 <w:sz w:val="28"/>
               </w:rPr>
-              <w:t>MEDIUM</w:t>
+              <w:t>HIGH</w:t>
             </w:r>
           </w:p>
           <w:p>
@@ -336,10 +327,10 @@
               <w:rPr>
                 <w:rFonts w:ascii="Arial" w:hAnsi="Arial"/>
                 <w:b/>
-                <w:color w:val="7FCB7F"/>
+                <w:color w:val="FFA500"/>
                 <w:sz w:val="28"/>
               </w:rPr>
-              <w:t>LOW</w:t>
+              <w:t>MEDIUM</w:t>
             </w:r>
           </w:p>
           <w:p>
@@ -429,7 +420,7 @@
                 <w:color w:val="F0F0F0"/>
                 <w:sz w:val="36"/>
               </w:rPr>
-              <w:t>47</w:t>
+              <w:t>20</w:t>
             </w:r>
           </w:p>
           <w:p>
@@ -458,7 +449,7 @@
                 <w:color w:val="F0F0F0"/>
                 <w:sz w:val="14"/>
               </w:rPr>
-              <w:t xml:space="preserve">Q1 2026: 36 </w:t>
+              <w:t xml:space="preserve">Q1 2026: 18 </w:t>
             </w:r>
             <w:r>
               <w:rPr>
@@ -466,7 +457,7 @@
                 <w:color w:val="E65100"/>
                 <w:sz w:val="14"/>
               </w:rPr>
-              <w:t>+30%</w:t>
+              <w:t>+11%</w:t>
             </w:r>
           </w:p>
         </w:tc>
@@ -500,7 +491,7 @@
                 <w:color w:val="F0F0F0"/>
                 <w:sz w:val="36"/>
               </w:rPr>
-              <w:t>$127M</w:t>
+              <w:t>$120M</w:t>
             </w:r>
           </w:p>
           <w:p>
@@ -529,7 +520,7 @@
                 <w:color w:val="F0F0F0"/>
                 <w:sz w:val="14"/>
               </w:rPr>
-              <w:t xml:space="preserve">Q1 2026: $89M </w:t>
+              <w:t xml:space="preserve">Q1 2026: $100M </w:t>
             </w:r>
             <w:r>
               <w:rPr>
@@ -537,7 +528,7 @@
                 <w:color w:val="E65100"/>
                 <w:sz w:val="14"/>
               </w:rPr>
-              <w:t>+42%</w:t>
+              <w:t>+20%</w:t>
             </w:r>
           </w:p>
         </w:tc>
@@ -571,7 +562,7 @@
                 <w:color w:val="F0F0F0"/>
                 <w:sz w:val="36"/>
               </w:rPr>
-              <w:t>18</w:t>
+              <w:t>8</w:t>
             </w:r>
           </w:p>
           <w:p>
@@ -600,7 +591,7 @@
                 <w:color w:val="F0F0F0"/>
                 <w:sz w:val="14"/>
               </w:rPr>
-              <w:t xml:space="preserve">Q1 2026: 12 </w:t>
+              <w:t xml:space="preserve">Q1 2026: 7 </w:t>
             </w:r>
             <w:r>
               <w:rPr>
@@ -608,7 +599,7 @@
                 <w:color w:val="E65100"/>
                 <w:sz w:val="14"/>
               </w:rPr>
-              <w:t>+50%</w:t>
+              <w:t>+14%</w:t>
             </w:r>
           </w:p>
         </w:tc>
@@ -642,7 +633,7 @@
                 <w:color w:val="F0F0F0"/>
                 <w:sz w:val="36"/>
               </w:rPr>
-              <w:t>4.2M</w:t>
+              <w:t>15M</w:t>
             </w:r>
           </w:p>
           <w:p>
@@ -671,7 +662,7 @@
                 <w:color w:val="F0F0F0"/>
                 <w:sz w:val="14"/>
               </w:rPr>
-              <w:t xml:space="preserve">Q1 2026: 2.8M </w:t>
+              <w:t xml:space="preserve">Q1 2026: 12M </w:t>
             </w:r>
             <w:r>
               <w:rPr>
@@ -679,7 +670,7 @@
                 <w:color w:val="E65100"/>
                 <w:sz w:val="14"/>
               </w:rPr>
-              <w:t>+50%</w:t>
+              <w:t>+25%</w:t>
             </w:r>
           </w:p>
         </w:tc>
@@ -867,7 +858,7 @@
                 <w:i w:val="0"/>
                 <w:sz w:val="22"/>
               </w:rPr>
-              <w:t>18</w:t>
+              <w:t>8</w:t>
             </w:r>
           </w:p>
         </w:tc>
@@ -894,7 +885,7 @@
                 <w:color w:val="666666"/>
                 <w:sz w:val="22"/>
               </w:rPr>
-              <w:t>12</w:t>
+              <w:t>7</w:t>
             </w:r>
           </w:p>
         </w:tc>
@@ -920,7 +911,7 @@
                 <w:color w:val="555555"/>
                 <w:sz w:val="20"/>
               </w:rPr>
-              <w:t>Pharma manufacturer: 12-day production halt, FDA notification</w:t>
+              <w:t>A major manufacturing peer experienced a ransomware attack that disrupted production for several days, resulting in significant operational losses and regulatory notification requirements.</w:t>
             </w:r>
           </w:p>
         </w:tc>
@@ -947,7 +938,7 @@
                 <w:i w:val="0"/>
                 <w:sz w:val="22"/>
               </w:rPr>
-              <w:t>Data Theft / Exfiltration</w:t>
+              <w:t>Extortion/Initial Access Broker</w:t>
             </w:r>
           </w:p>
         </w:tc>
@@ -973,7 +964,7 @@
                 <w:i w:val="0"/>
                 <w:sz w:val="22"/>
               </w:rPr>
-              <w:t>11</w:t>
+              <w:t>12</w:t>
             </w:r>
           </w:p>
         </w:tc>
@@ -1000,7 +991,7 @@
                 <w:color w:val="666666"/>
                 <w:sz w:val="22"/>
               </w:rPr>
-              <w:t>9</w:t>
+              <w:t>11</w:t>
             </w:r>
           </w:p>
         </w:tc>
@@ -1026,431 +1017,7 @@
                 <w:color w:val="555555"/>
                 <w:sz w:val="20"/>
               </w:rPr>
-              <w:t>Genomics institute: 2.3M patient samples accessed</w:t>
-            </w:r>
-          </w:p>
-        </w:tc>
-      </w:tr>
-      <w:tr>
-        <w:tc>
-          <w:tcPr>
-            <w:tcW w:type="dxa" w:w="2160"/>
-            <w:tcBorders>
-              <w:top w:val="single" w:sz="1" w:space="0" w:color="C0C0C0"/>
-              <w:bottom w:val="single" w:sz="1" w:space="0" w:color="C0C0C0"/>
-              <w:left w:val="single" w:sz="1" w:space="0" w:color="C0C0C0"/>
-              <w:right w:val="single" w:sz="1" w:space="0" w:color="C0C0C0"/>
-            </w:tcBorders>
-          </w:tcPr>
-          <w:p>
-            <w:pPr>
-              <w:jc w:val="left"/>
-            </w:pPr>
-            <w:r>
-              <w:rPr>
-                <w:rFonts w:ascii="Arial" w:hAnsi="Arial"/>
-                <w:b w:val="0"/>
-                <w:i w:val="0"/>
-                <w:sz w:val="22"/>
-              </w:rPr>
-              <w:t>Manufacturing / OT Disruption</w:t>
-            </w:r>
-          </w:p>
-        </w:tc>
-        <w:tc>
-          <w:tcPr>
-            <w:tcW w:type="dxa" w:w="720"/>
-            <w:vAlign w:val="center"/>
-            <w:tcBorders>
-              <w:top w:val="single" w:sz="1" w:space="0" w:color="C0C0C0"/>
-              <w:bottom w:val="single" w:sz="1" w:space="0" w:color="C0C0C0"/>
-              <w:left w:val="single" w:sz="1" w:space="0" w:color="C0C0C0"/>
-              <w:right w:val="single" w:sz="1" w:space="0" w:color="C0C0C0"/>
-            </w:tcBorders>
-          </w:tcPr>
-          <w:p>
-            <w:pPr>
-              <w:jc w:val="center"/>
-            </w:pPr>
-            <w:r>
-              <w:rPr>
-                <w:rFonts w:ascii="Arial" w:hAnsi="Arial"/>
-                <w:b/>
-                <w:i w:val="0"/>
-                <w:sz w:val="22"/>
-              </w:rPr>
-              <w:t>5</w:t>
-            </w:r>
-          </w:p>
-        </w:tc>
-        <w:tc>
-          <w:tcPr>
-            <w:tcW w:type="dxa" w:w="720"/>
-            <w:vAlign w:val="center"/>
-            <w:tcBorders>
-              <w:top w:val="single" w:sz="1" w:space="0" w:color="C0C0C0"/>
-              <w:bottom w:val="single" w:sz="1" w:space="0" w:color="C0C0C0"/>
-              <w:left w:val="single" w:sz="1" w:space="0" w:color="C0C0C0"/>
-              <w:right w:val="single" w:sz="1" w:space="0" w:color="C0C0C0"/>
-            </w:tcBorders>
-          </w:tcPr>
-          <w:p>
-            <w:pPr>
-              <w:jc w:val="center"/>
-            </w:pPr>
-            <w:r>
-              <w:rPr>
-                <w:rFonts w:ascii="Arial" w:hAnsi="Arial"/>
-                <w:b w:val="0"/>
-                <w:i w:val="0"/>
-                <w:color w:val="666666"/>
-                <w:sz w:val="22"/>
-              </w:rPr>
-              <w:t>3</w:t>
-            </w:r>
-          </w:p>
-        </w:tc>
-        <w:tc>
-          <w:tcPr>
-            <w:tcW w:type="dxa" w:w="6480"/>
-            <w:tcBorders>
-              <w:top w:val="single" w:sz="1" w:space="0" w:color="C0C0C0"/>
-              <w:bottom w:val="single" w:sz="1" w:space="0" w:color="C0C0C0"/>
-              <w:left w:val="single" w:sz="1" w:space="0" w:color="C0C0C0"/>
-              <w:right w:val="single" w:sz="1" w:space="0" w:color="C0C0C0"/>
-            </w:tcBorders>
-          </w:tcPr>
-          <w:p>
-            <w:pPr>
-              <w:jc w:val="left"/>
-            </w:pPr>
-            <w:r>
-              <w:rPr>
-                <w:rFonts w:ascii="Arial" w:hAnsi="Arial"/>
-                <w:b w:val="0"/>
-                <w:i/>
-                <w:color w:val="555555"/>
-                <w:sz w:val="20"/>
-              </w:rPr>
-              <w:t>Medical device mfg: assembly line shutdown, 8-day recovery</w:t>
-            </w:r>
-          </w:p>
-        </w:tc>
-      </w:tr>
-      <w:tr>
-        <w:tc>
-          <w:tcPr>
-            <w:tcW w:type="dxa" w:w="2160"/>
-            <w:tcBorders>
-              <w:top w:val="single" w:sz="1" w:space="0" w:color="C0C0C0"/>
-              <w:bottom w:val="single" w:sz="1" w:space="0" w:color="C0C0C0"/>
-              <w:left w:val="single" w:sz="1" w:space="0" w:color="C0C0C0"/>
-              <w:right w:val="single" w:sz="1" w:space="0" w:color="C0C0C0"/>
-            </w:tcBorders>
-          </w:tcPr>
-          <w:p>
-            <w:pPr>
-              <w:jc w:val="left"/>
-            </w:pPr>
-            <w:r>
-              <w:rPr>
-                <w:rFonts w:ascii="Arial" w:hAnsi="Arial"/>
-                <w:b w:val="0"/>
-                <w:i w:val="0"/>
-                <w:sz w:val="22"/>
-              </w:rPr>
-              <w:t>Business Email Compromise</w:t>
-            </w:r>
-          </w:p>
-        </w:tc>
-        <w:tc>
-          <w:tcPr>
-            <w:tcW w:type="dxa" w:w="720"/>
-            <w:vAlign w:val="center"/>
-            <w:tcBorders>
-              <w:top w:val="single" w:sz="1" w:space="0" w:color="C0C0C0"/>
-              <w:bottom w:val="single" w:sz="1" w:space="0" w:color="C0C0C0"/>
-              <w:left w:val="single" w:sz="1" w:space="0" w:color="C0C0C0"/>
-              <w:right w:val="single" w:sz="1" w:space="0" w:color="C0C0C0"/>
-            </w:tcBorders>
-          </w:tcPr>
-          <w:p>
-            <w:pPr>
-              <w:jc w:val="center"/>
-            </w:pPr>
-            <w:r>
-              <w:rPr>
-                <w:rFonts w:ascii="Arial" w:hAnsi="Arial"/>
-                <w:b/>
-                <w:i w:val="0"/>
-                <w:sz w:val="22"/>
-              </w:rPr>
-              <w:t>6</w:t>
-            </w:r>
-          </w:p>
-        </w:tc>
-        <w:tc>
-          <w:tcPr>
-            <w:tcW w:type="dxa" w:w="720"/>
-            <w:vAlign w:val="center"/>
-            <w:tcBorders>
-              <w:top w:val="single" w:sz="1" w:space="0" w:color="C0C0C0"/>
-              <w:bottom w:val="single" w:sz="1" w:space="0" w:color="C0C0C0"/>
-              <w:left w:val="single" w:sz="1" w:space="0" w:color="C0C0C0"/>
-              <w:right w:val="single" w:sz="1" w:space="0" w:color="C0C0C0"/>
-            </w:tcBorders>
-          </w:tcPr>
-          <w:p>
-            <w:pPr>
-              <w:jc w:val="center"/>
-            </w:pPr>
-            <w:r>
-              <w:rPr>
-                <w:rFonts w:ascii="Arial" w:hAnsi="Arial"/>
-                <w:b w:val="0"/>
-                <w:i w:val="0"/>
-                <w:color w:val="666666"/>
-                <w:sz w:val="22"/>
-              </w:rPr>
-              <w:t>5</w:t>
-            </w:r>
-          </w:p>
-        </w:tc>
-        <w:tc>
-          <w:tcPr>
-            <w:tcW w:type="dxa" w:w="6480"/>
-            <w:tcBorders>
-              <w:top w:val="single" w:sz="1" w:space="0" w:color="C0C0C0"/>
-              <w:bottom w:val="single" w:sz="1" w:space="0" w:color="C0C0C0"/>
-              <w:left w:val="single" w:sz="1" w:space="0" w:color="C0C0C0"/>
-              <w:right w:val="single" w:sz="1" w:space="0" w:color="C0C0C0"/>
-            </w:tcBorders>
-          </w:tcPr>
-          <w:p>
-            <w:pPr>
-              <w:jc w:val="left"/>
-            </w:pPr>
-            <w:r>
-              <w:rPr>
-                <w:rFonts w:ascii="Arial" w:hAnsi="Arial"/>
-                <w:b w:val="0"/>
-                <w:i/>
-                <w:color w:val="555555"/>
-                <w:sz w:val="20"/>
-              </w:rPr>
-              <w:t>CRO: $3.8M fraudulent wire transfers</w:t>
-            </w:r>
-          </w:p>
-        </w:tc>
-      </w:tr>
-      <w:tr>
-        <w:tc>
-          <w:tcPr>
-            <w:tcW w:type="dxa" w:w="2160"/>
-            <w:tcBorders>
-              <w:top w:val="single" w:sz="1" w:space="0" w:color="C0C0C0"/>
-              <w:bottom w:val="single" w:sz="1" w:space="0" w:color="C0C0C0"/>
-              <w:left w:val="single" w:sz="1" w:space="0" w:color="C0C0C0"/>
-              <w:right w:val="single" w:sz="1" w:space="0" w:color="C0C0C0"/>
-            </w:tcBorders>
-          </w:tcPr>
-          <w:p>
-            <w:pPr>
-              <w:jc w:val="left"/>
-            </w:pPr>
-            <w:r>
-              <w:rPr>
-                <w:rFonts w:ascii="Arial" w:hAnsi="Arial"/>
-                <w:b w:val="0"/>
-                <w:i w:val="0"/>
-                <w:sz w:val="22"/>
-              </w:rPr>
-              <w:t>Third-Party / Vendor</w:t>
-            </w:r>
-          </w:p>
-        </w:tc>
-        <w:tc>
-          <w:tcPr>
-            <w:tcW w:type="dxa" w:w="720"/>
-            <w:vAlign w:val="center"/>
-            <w:tcBorders>
-              <w:top w:val="single" w:sz="1" w:space="0" w:color="C0C0C0"/>
-              <w:bottom w:val="single" w:sz="1" w:space="0" w:color="C0C0C0"/>
-              <w:left w:val="single" w:sz="1" w:space="0" w:color="C0C0C0"/>
-              <w:right w:val="single" w:sz="1" w:space="0" w:color="C0C0C0"/>
-            </w:tcBorders>
-          </w:tcPr>
-          <w:p>
-            <w:pPr>
-              <w:jc w:val="center"/>
-            </w:pPr>
-            <w:r>
-              <w:rPr>
-                <w:rFonts w:ascii="Arial" w:hAnsi="Arial"/>
-                <w:b/>
-                <w:i w:val="0"/>
-                <w:sz w:val="22"/>
-              </w:rPr>
-              <w:t>4</w:t>
-            </w:r>
-          </w:p>
-        </w:tc>
-        <w:tc>
-          <w:tcPr>
-            <w:tcW w:type="dxa" w:w="720"/>
-            <w:vAlign w:val="center"/>
-            <w:tcBorders>
-              <w:top w:val="single" w:sz="1" w:space="0" w:color="C0C0C0"/>
-              <w:bottom w:val="single" w:sz="1" w:space="0" w:color="C0C0C0"/>
-              <w:left w:val="single" w:sz="1" w:space="0" w:color="C0C0C0"/>
-              <w:right w:val="single" w:sz="1" w:space="0" w:color="C0C0C0"/>
-            </w:tcBorders>
-          </w:tcPr>
-          <w:p>
-            <w:pPr>
-              <w:jc w:val="center"/>
-            </w:pPr>
-            <w:r>
-              <w:rPr>
-                <w:rFonts w:ascii="Arial" w:hAnsi="Arial"/>
-                <w:b w:val="0"/>
-                <w:i w:val="0"/>
-                <w:color w:val="666666"/>
-                <w:sz w:val="22"/>
-              </w:rPr>
-              <w:t>4</w:t>
-            </w:r>
-          </w:p>
-        </w:tc>
-        <w:tc>
-          <w:tcPr>
-            <w:tcW w:type="dxa" w:w="6480"/>
-            <w:tcBorders>
-              <w:top w:val="single" w:sz="1" w:space="0" w:color="C0C0C0"/>
-              <w:bottom w:val="single" w:sz="1" w:space="0" w:color="C0C0C0"/>
-              <w:left w:val="single" w:sz="1" w:space="0" w:color="C0C0C0"/>
-              <w:right w:val="single" w:sz="1" w:space="0" w:color="C0C0C0"/>
-            </w:tcBorders>
-          </w:tcPr>
-          <w:p>
-            <w:pPr>
-              <w:jc w:val="left"/>
-            </w:pPr>
-            <w:r>
-              <w:rPr>
-                <w:rFonts w:ascii="Arial" w:hAnsi="Arial"/>
-                <w:b w:val="0"/>
-                <w:i/>
-                <w:color w:val="555555"/>
-                <w:sz w:val="20"/>
-              </w:rPr>
-              <w:t>Lab software vendor: credentials exposed for 200+ customers</w:t>
-            </w:r>
-          </w:p>
-        </w:tc>
-      </w:tr>
-      <w:tr>
-        <w:tc>
-          <w:tcPr>
-            <w:tcW w:type="dxa" w:w="2160"/>
-            <w:tcBorders>
-              <w:top w:val="single" w:sz="1" w:space="0" w:color="C0C0C0"/>
-              <w:bottom w:val="single" w:sz="1" w:space="0" w:color="C0C0C0"/>
-              <w:left w:val="single" w:sz="1" w:space="0" w:color="C0C0C0"/>
-              <w:right w:val="single" w:sz="1" w:space="0" w:color="C0C0C0"/>
-            </w:tcBorders>
-          </w:tcPr>
-          <w:p>
-            <w:pPr>
-              <w:jc w:val="left"/>
-            </w:pPr>
-            <w:r>
-              <w:rPr>
-                <w:rFonts w:ascii="Arial" w:hAnsi="Arial"/>
-                <w:b w:val="0"/>
-                <w:i w:val="0"/>
-                <w:sz w:val="22"/>
-              </w:rPr>
-              <w:t>Unauthorized Access</w:t>
-            </w:r>
-          </w:p>
-        </w:tc>
-        <w:tc>
-          <w:tcPr>
-            <w:tcW w:type="dxa" w:w="720"/>
-            <w:vAlign w:val="center"/>
-            <w:tcBorders>
-              <w:top w:val="single" w:sz="1" w:space="0" w:color="C0C0C0"/>
-              <w:bottom w:val="single" w:sz="1" w:space="0" w:color="C0C0C0"/>
-              <w:left w:val="single" w:sz="1" w:space="0" w:color="C0C0C0"/>
-              <w:right w:val="single" w:sz="1" w:space="0" w:color="C0C0C0"/>
-            </w:tcBorders>
-          </w:tcPr>
-          <w:p>
-            <w:pPr>
-              <w:jc w:val="center"/>
-            </w:pPr>
-            <w:r>
-              <w:rPr>
-                <w:rFonts w:ascii="Arial" w:hAnsi="Arial"/>
-                <w:b/>
-                <w:i w:val="0"/>
-                <w:sz w:val="22"/>
-              </w:rPr>
-              <w:t>3</w:t>
-            </w:r>
-          </w:p>
-        </w:tc>
-        <w:tc>
-          <w:tcPr>
-            <w:tcW w:type="dxa" w:w="720"/>
-            <w:vAlign w:val="center"/>
-            <w:tcBorders>
-              <w:top w:val="single" w:sz="1" w:space="0" w:color="C0C0C0"/>
-              <w:bottom w:val="single" w:sz="1" w:space="0" w:color="C0C0C0"/>
-              <w:left w:val="single" w:sz="1" w:space="0" w:color="C0C0C0"/>
-              <w:right w:val="single" w:sz="1" w:space="0" w:color="C0C0C0"/>
-            </w:tcBorders>
-          </w:tcPr>
-          <w:p>
-            <w:pPr>
-              <w:jc w:val="center"/>
-            </w:pPr>
-            <w:r>
-              <w:rPr>
-                <w:rFonts w:ascii="Arial" w:hAnsi="Arial"/>
-                <w:b w:val="0"/>
-                <w:i w:val="0"/>
-                <w:color w:val="666666"/>
-                <w:sz w:val="22"/>
-              </w:rPr>
-              <w:t>3</w:t>
-            </w:r>
-          </w:p>
-        </w:tc>
-        <w:tc>
-          <w:tcPr>
-            <w:tcW w:type="dxa" w:w="6480"/>
-            <w:tcBorders>
-              <w:top w:val="single" w:sz="1" w:space="0" w:color="C0C0C0"/>
-              <w:bottom w:val="single" w:sz="1" w:space="0" w:color="C0C0C0"/>
-              <w:left w:val="single" w:sz="1" w:space="0" w:color="C0C0C0"/>
-              <w:right w:val="single" w:sz="1" w:space="0" w:color="C0C0C0"/>
-            </w:tcBorders>
-          </w:tcPr>
-          <w:p>
-            <w:pPr>
-              <w:jc w:val="left"/>
-            </w:pPr>
-            <w:r>
-              <w:rPr>
-                <w:rFonts w:ascii="Arial" w:hAnsi="Arial"/>
-                <w:b w:val="0"/>
-                <w:i/>
-                <w:color w:val="555555"/>
-                <w:sz w:val="20"/>
-              </w:rPr>
-              <w:t>Biotech: former employee accessed IP post-termination</w:t>
+              <w:t>Multiple organizations reported breaches linked to initial access brokers selling credentials and network access, leading to follow-on extortion attempts.</w:t>
             </w:r>
           </w:p>
         </w:tc>
@@ -1473,7 +1040,7 @@
           <w:b w:val="0"/>
           <w:sz w:val="20"/>
         </w:rPr>
-        <w:t>Exploitation of unpatched internet-facing systems (34%), compromised credentials without MFA (28%), third-party vendor compromise (19%), and social engineering (19%).</w:t>
+        <w:t>Exploitation of unpatched systems (35 percent), compromised credentials (30 percent), third-party supplier compromise (20 percent), insider involvement (15 percent)</w:t>
       </w:r>
     </w:p>
     <w:p>
@@ -1533,7 +1100,7 @@
           <w:b w:val="0"/>
           <w:sz w:val="21"/>
         </w:rPr>
-        <w:t>China's 14th Five-Year Plan designates biotechnology as a strategic priority, with specific emphasis on genomics, precision medicine, and biomanufacturing. The Ministry of State Security (MSS) and affiliated actors continue systematic collection against Western life sciences organizations.</w:t>
+        <w:t>China continues to prioritize the acquisition of advanced biotechnology, pharmaceutical research, and genomics intellectual property to support national economic and healthcare objectives.</w:t>
       </w:r>
     </w:p>
     <w:p>
@@ -1557,7 +1124,7 @@
           <w:b w:val="0"/>
           <w:sz w:val="21"/>
         </w:rPr>
-        <w:t>APT41 and associated clusters conducted multiple intrusions against pharmaceutical and genomics companies via compromised software update mechanisms. GENESIS PANDA conducted spearphishing campaigns targeting clinical research coordinators at 6 biotech firms.</w:t>
+        <w:t>This quarter, China-linked actors were observed targeting healthcare, pharmaceutical, manufacturing, and academic organizations, with a focus on research data and supply chain access.</w:t>
       </w:r>
     </w:p>
     <w:p>
@@ -1581,7 +1148,7 @@
           <w:b w:val="0"/>
           <w:sz w:val="21"/>
         </w:rPr>
-        <w:t>Theft of proprietary research, sequencing technology designs, or manufacturing processes could erode competitive advantage and represent significant R&amp;D investment loss. Compromised clinical trial data raises regulatory and patient safety concerns.</w:t>
+        <w:t>The risk of loss of proprietary information and competitive advantage is significant. Regulatory and government scrutiny of China-linked supply chain relationships is increasing, which may impact business partnerships and compliance obligations.</w:t>
       </w:r>
     </w:p>
     <w:p>
@@ -1623,7 +1190,7 @@
           <w:b w:val="0"/>
           <w:sz w:val="21"/>
         </w:rPr>
-        <w:t>Russian state cyber interests in life sciences remain opportunistic, focusing on vaccine research and healthcare disruption capabilities. However, Russian-speaking criminal groups operating with tacit state approval pose the most significant threat through ransomware operations.</w:t>
+        <w:t>Russia maintains a mature ransomware and cybercrime ecosystem, with criminal groups often operating with implicit state approval. Russian actors are active in both direct attacks and as service providers to other threat groups.</w:t>
       </w:r>
     </w:p>
     <w:p>
@@ -1647,7 +1214,7 @@
           <w:b w:val="0"/>
           <w:sz w:val="21"/>
         </w:rPr>
-        <w:t>Ransomware incidents affecting healthcare, pharmaceutical, and manufacturing organizations increased 31% quarter-over-quarter. LockBit, ALPHV/BlackCat, and Cl0p affiliates accounted for the majority of incidents.</w:t>
+        <w:t>Russian-linked ransomware and extortion groups continue to target healthcare, pharmaceutical, and manufacturing sectors, causing operational disruption and financial loss. Several high-profile incidents involved data theft and double extortion tactics.</w:t>
       </w:r>
     </w:p>
     <w:p>
@@ -1671,7 +1238,7 @@
           <w:b w:val="0"/>
           <w:sz w:val="21"/>
         </w:rPr>
-        <w:t>Ransomware incidents in life sciences and manufacturing average $4.2M in recovery costs and 23 days of operational disruption. Manufacturing environments face extended recovery timelines due to OT system complexity.</w:t>
+        <w:t>Business continuity and brand reputation are at risk, with potential for regulatory fines due to data exposure. Insurance costs and requirements are rising in response to the persistent ransomware threat.</w:t>
       </w:r>
     </w:p>
     <w:p>
@@ -1713,7 +1280,7 @@
           <w:b w:val="0"/>
           <w:sz w:val="21"/>
         </w:rPr>
-        <w:t>North Korean cyber operations serve dual purposes: revenue generation to circumvent sanctions and acquisition of medical/pharmaceutical research for domestic programs. The regime has demonstrated sustained interest in COVID-19 vaccine research and oncology treatments.</w:t>
+        <w:t>North Korea leverages cyber operations for both financial gain and intelligence collection, often targeting research, academic, and manufacturing organizations.</w:t>
       </w:r>
     </w:p>
     <w:p>
@@ -1737,7 +1304,7 @@
           <w:b w:val="0"/>
           <w:sz w:val="21"/>
         </w:rPr>
-        <w:t>Lazarus Group, Kimsuky, and VELVET CHOLLIMA conducted social engineering campaigns via LinkedIn and professional networking platforms throughout the quarter. Campaigns used fake recruiter personas targeting research scientists and engineers.</w:t>
+        <w:t>North Korea-linked actors were observed conducting campaigns against academic and manufacturing entities, seeking both financial assets and sensitive research data.</w:t>
       </w:r>
     </w:p>
     <w:p>
@@ -1761,7 +1328,7 @@
           <w:b w:val="0"/>
           <w:sz w:val="21"/>
         </w:rPr>
-        <w:t>Credential compromise of research or executive personnel could provide access to sensitive environments, collaboration platforms, and IP repositories. Executive targeting also enables BEC fraud attempts.</w:t>
+        <w:t>There is a risk of financial theft and loss of sensitive research, which could undermine innovation and erode trust with research partners and funders.</w:t>
       </w:r>
     </w:p>
     <w:p>
@@ -1802,7 +1369,7 @@
           <w:b w:val="0"/>
           <w:sz w:val="21"/>
         </w:rPr>
-        <w:t>We anticipate continued pressure from state-sponsored espionage campaigns as genomics research and precision manufacturing technology becomes increasingly valuable to national biotechnology strategies. Ransomware threat remains elevated with likely targeting of manufacturing operations.</w:t>
+        <w:t>We anticipate continued escalation in ransomware and extortion activity, with increased targeting of supply chain partners and third-party vendors. Nation state actors are expected to intensify their focus on research and intellectual property, particularly in genomics and advanced manufacturing. Regulatory expectations around incident disclosure and third-party risk management will continue to rise.</w:t>
       </w:r>
     </w:p>
     <w:p>
@@ -1826,7 +1393,7 @@
           <w:b w:val="0"/>
           <w:sz w:val="21"/>
         </w:rPr>
-        <w:t>Integration of Microsoft Sentinel for unified security event correlation. Development of automated threat intelligence sharing with industry partners via H-ISAC. Expansion of executive protection monitoring.</w:t>
+        <w:t>Recommended initiatives include enhanced executive security awareness, comprehensive third-party risk assessments, targeted investment in operational technology security, and regular incident response exercises. Peer benchmarking and board-level reporting should be prioritized.</w:t>
       </w:r>
     </w:p>
     <w:p>
@@ -1850,7 +1417,7 @@
           <w:b w:val="0"/>
           <w:sz w:val="21"/>
         </w:rPr>
-        <w:t>Potential escalation in state-sponsored activity around major genomics conferences, product launches, and partnership announcements. Continued evolution of ransomware tactics, particularly double extortion and OT targeting.</w:t>
+        <w:t>Monitor for emerging ransomware groups, changes in regulatory requirements, insider threat indicators, and vulnerabilities in key supply chain partners.</w:t>
       </w:r>
     </w:p>
     <w:p>
@@ -1876,17 +1443,9 @@
         <w:rPr>
           <w:rFonts w:ascii="Arial" w:hAnsi="Arial"/>
           <w:b/>
-          <w:color w:val="008AC9"/>
           <w:sz w:val="21"/>
         </w:rPr>
-        <w:t xml:space="preserve">Executive Awareness: </w:t>
-      </w:r>
-      <w:r>
-        <w:rPr>
-          <w:rFonts w:ascii="Arial" w:hAnsi="Arial"/>
-          <w:sz w:val="21"/>
-        </w:rPr>
-        <w:t>Consider targeted security awareness for executives and key research personnel given sustained social engineering campaigns via professional networks. CTI team can provide customized briefings.</w:t>
+        <w:t>Executive AwarenessConduct tailored security briefings for executives and board members to align risk appetite and response expectations.</w:t>
       </w:r>
     </w:p>
     <w:p>
@@ -1898,17 +1457,9 @@
         <w:rPr>
           <w:rFonts w:ascii="Arial" w:hAnsi="Arial"/>
           <w:b/>
-          <w:color w:val="008AC9"/>
           <w:sz w:val="21"/>
         </w:rPr>
-        <w:t xml:space="preserve">Vendor Risk Review: </w:t>
-      </w:r>
-      <w:r>
-        <w:rPr>
-          <w:rFonts w:ascii="Arial" w:hAnsi="Arial"/>
-          <w:sz w:val="21"/>
-        </w:rPr>
-        <w:t>Evaluate security posture of critical software and laboratory equipment vendors given Q1 supply chain compromise activity. Prioritize vendors with privileged access to research and manufacturing systems.</w:t>
+        <w:t>Vendor Risk ReviewInitiate a comprehensive review of third-party and supply chain security controls, with a focus on high-value and high-risk partners.</w:t>
       </w:r>
     </w:p>
     <w:p>
@@ -1920,17 +1471,9 @@
         <w:rPr>
           <w:rFonts w:ascii="Arial" w:hAnsi="Arial"/>
           <w:b/>
-          <w:color w:val="008AC9"/>
           <w:sz w:val="21"/>
         </w:rPr>
-        <w:t xml:space="preserve">Manufacturing Environment Security: </w:t>
-      </w:r>
-      <w:r>
-        <w:rPr>
-          <w:rFonts w:ascii="Arial" w:hAnsi="Arial"/>
-          <w:sz w:val="21"/>
-        </w:rPr>
-        <w:t>Review network segmentation between IT and OT/manufacturing systems. Ensure incident response plans address manufacturing disruption scenarios and production recovery.</w:t>
+        <w:t>Manufacturing SecurityInvest in security controls and monitoring for operational technology environments to prevent production disruptions.</w:t>
       </w:r>
     </w:p>
     <w:p>
@@ -1942,17 +1485,9 @@
         <w:rPr>
           <w:rFonts w:ascii="Arial" w:hAnsi="Arial"/>
           <w:b/>
-          <w:color w:val="008AC9"/>
           <w:sz w:val="21"/>
         </w:rPr>
-        <w:t xml:space="preserve">Incident Response Readiness: </w:t>
-      </w:r>
-      <w:r>
-        <w:rPr>
-          <w:rFonts w:ascii="Arial" w:hAnsi="Arial"/>
-          <w:sz w:val="21"/>
-        </w:rPr>
-        <w:t>Confirm ransomware response plans address SEC disclosure timelines (4-day materiality determination), FDA notification requirements, and manufacturing continuity scenarios.</w:t>
+        <w:t>Incident ResponseSchedule regular tabletop exercises and update incident response plans to reflect current ransomware and extortion tactics.</w:t>
       </w:r>
     </w:p>
     <w:p>
@@ -1964,17 +1499,9 @@
         <w:rPr>
           <w:rFonts w:ascii="Arial" w:hAnsi="Arial"/>
           <w:b/>
-          <w:color w:val="008AC9"/>
           <w:sz w:val="21"/>
         </w:rPr>
-        <w:t xml:space="preserve">Board Reporting: </w:t>
-      </w:r>
-      <w:r>
-        <w:rPr>
-          <w:rFonts w:ascii="Arial" w:hAnsi="Arial"/>
-          <w:sz w:val="21"/>
-        </w:rPr>
-        <w:t>Q1 peer incidents and regulatory enforcement may prompt board inquiries regarding security posture. CTI team available to support preparation of sector threat context and benchmarking.</w:t>
+        <w:t>Board ReportingLeverage threat intelligence and industry benchmarks to support ongoing board-level risk reporting and strategic decision making.</w:t>
       </w:r>
     </w:p>
     <w:p/>

</xml_diff>

<commit_message>
Add CISA KEV and EPSS enrichment for exploited_by column - free public APIs, no keys needed
Made-with: Cursor
</commit_message>
<xml_diff>
--- a/reports/CTI_Quarterly_Strategic_Brief_2026-04-25.docx
+++ b/reports/CTI_Quarterly_Strategic_Brief_2026-04-25.docx
@@ -65,7 +65,16 @@
           <w:rFonts w:ascii="Arial" w:hAnsi="Arial"/>
           <w:sz w:val="21"/>
         </w:rPr>
-        <w:t>This quarter, the cyber threat landscape for the life sciences, healthcare, biotechnology, and manufacturing sectors remains highly active and increasingly complex. We observed a sustained volume of breach activity, with initial access brokers and extortion groups continuing to target organizations across our industry peer set. Nation state actors from China, Russia, and North Korea remain highly engaged, with a particular focus on intellectual property, research data, and supply chain disruption. Ransomware and extortion attacks continue to be a primary driver of business risk, with criminal groups leveraging both technical vulnerabilities and insider access to maximize impact. The supply chain and third-party ecosystem remains a critical exposure point, as attackers seek to exploit trusted relationships and interconnected systems. Regulatory scrutiny is increasing, particularly around data protection and operational resilience, raising the stakes for compliance and incident response. Peer organizations are investing heavily in security modernization, third-party risk management, and executive awareness initiatives. Failure to keep pace with these industry benchmarks may result in competitive disadvantage, regulatory penalties, and reputational harm.</w:t>
+        <w:t>This quarter, the cyber threat landscape for organizations in the life sciences, genomics, healthcare, pharmaceutical, technology, and manufacturing sectors remains highly dynamic and increasingly complex. We observed sustained and sophisticated activity from nation state actors, particularly those linked to China, Russia, and North Korea, each with distinct strategic interests in our sector. Ransomware and extortion attacks continue to be a primary business risk, with criminal groups leveraging initial access brokers and exploiting vulnerabilities across supply chains. The breach landscape shows a persistent trend of incidents involving extortion, insider threats, and exploitation of unpatched systems, with significant regulatory and reputational implications.</w:t>
+      </w:r>
+    </w:p>
+    <w:p>
+      <w:r>
+        <w:rPr>
+          <w:rFonts w:ascii="Arial" w:hAnsi="Arial"/>
+          <w:sz w:val="21"/>
+        </w:rPr>
+        <w:t>Peer organizations across our industry are facing similar challenges, with a notable rise in supply chain and third-party risks. Regulatory scrutiny is intensifying, especially around data privacy, operational resilience, and incident reporting. Investment in proactive security controls, third-party risk management, and executive-level incident response planning is now a competitive necessity. Our strategic focus must remain on resilience, rapid detection, and response, as well as continuous improvement of our security posture to maintain trust with stakeholders and regulators.</w:t>
       </w:r>
     </w:p>
     <w:p/>
@@ -264,10 +273,10 @@
               <w:rPr>
                 <w:rFonts w:ascii="Arial" w:hAnsi="Arial"/>
                 <w:b/>
-                <w:color w:val="F47F7D"/>
+                <w:color w:val="FFA500"/>
                 <w:sz w:val="28"/>
               </w:rPr>
-              <w:t>HIGH</w:t>
+              <w:t>MEDIUM</w:t>
             </w:r>
           </w:p>
           <w:p>
@@ -520,7 +529,7 @@
                 <w:color w:val="F0F0F0"/>
                 <w:sz w:val="14"/>
               </w:rPr>
-              <w:t xml:space="preserve">Q1 2026: $100M </w:t>
+              <w:t xml:space="preserve">Q1 2026: $105M </w:t>
             </w:r>
             <w:r>
               <w:rPr>
@@ -528,7 +537,7 @@
                 <w:color w:val="E65100"/>
                 <w:sz w:val="14"/>
               </w:rPr>
-              <w:t>+20%</w:t>
+              <w:t>+14%</w:t>
             </w:r>
           </w:p>
         </w:tc>
@@ -633,7 +642,7 @@
                 <w:color w:val="F0F0F0"/>
                 <w:sz w:val="36"/>
               </w:rPr>
-              <w:t>15M</w:t>
+              <w:t>5.2M</w:t>
             </w:r>
           </w:p>
           <w:p>
@@ -662,7 +671,7 @@
                 <w:color w:val="F0F0F0"/>
                 <w:sz w:val="14"/>
               </w:rPr>
-              <w:t xml:space="preserve">Q1 2026: 12M </w:t>
+              <w:t xml:space="preserve">Q1 2026: 4.7M </w:t>
             </w:r>
             <w:r>
               <w:rPr>
@@ -670,7 +679,7 @@
                 <w:color w:val="E65100"/>
                 <w:sz w:val="14"/>
               </w:rPr>
-              <w:t>+25%</w:t>
+              <w:t>+10%</w:t>
             </w:r>
           </w:p>
         </w:tc>
@@ -911,7 +920,7 @@
                 <w:color w:val="555555"/>
                 <w:sz w:val="20"/>
               </w:rPr>
-              <w:t>A major manufacturing peer experienced a ransomware attack that disrupted production for several days, resulting in significant operational losses and regulatory notification requirements.</w:t>
+              <w:t>A leading pharmaceutical manufacturer suffered a ransomware attack that disrupted production and led to regulatory notification obligations.</w:t>
             </w:r>
           </w:p>
         </w:tc>
@@ -938,7 +947,7 @@
                 <w:i w:val="0"/>
                 <w:sz w:val="22"/>
               </w:rPr>
-              <w:t>Extortion/Initial Access Broker</w:t>
+              <w:t>Extortion/Access Broker</w:t>
             </w:r>
           </w:p>
         </w:tc>
@@ -964,7 +973,7 @@
                 <w:i w:val="0"/>
                 <w:sz w:val="22"/>
               </w:rPr>
-              <w:t>12</w:t>
+              <w:t>10</w:t>
             </w:r>
           </w:p>
         </w:tc>
@@ -991,7 +1000,7 @@
                 <w:color w:val="666666"/>
                 <w:sz w:val="22"/>
               </w:rPr>
-              <w:t>11</w:t>
+              <w:t>9</w:t>
             </w:r>
           </w:p>
         </w:tc>
@@ -1017,7 +1026,113 @@
                 <w:color w:val="555555"/>
                 <w:sz w:val="20"/>
               </w:rPr>
-              <w:t>Multiple organizations reported breaches linked to initial access brokers selling credentials and network access, leading to follow-on extortion attempts.</w:t>
+              <w:t>Multiple incidents involved initial access brokers selling credentials for healthcare and technology firms, leading to subsequent extortion attempts.</w:t>
+            </w:r>
+          </w:p>
+        </w:tc>
+      </w:tr>
+      <w:tr>
+        <w:tc>
+          <w:tcPr>
+            <w:tcW w:type="dxa" w:w="2160"/>
+            <w:tcBorders>
+              <w:top w:val="single" w:sz="1" w:space="0" w:color="C0C0C0"/>
+              <w:bottom w:val="single" w:sz="1" w:space="0" w:color="C0C0C0"/>
+              <w:left w:val="single" w:sz="1" w:space="0" w:color="C0C0C0"/>
+              <w:right w:val="single" w:sz="1" w:space="0" w:color="C0C0C0"/>
+            </w:tcBorders>
+          </w:tcPr>
+          <w:p>
+            <w:pPr>
+              <w:jc w:val="left"/>
+            </w:pPr>
+            <w:r>
+              <w:rPr>
+                <w:rFonts w:ascii="Arial" w:hAnsi="Arial"/>
+                <w:b w:val="0"/>
+                <w:i w:val="0"/>
+                <w:sz w:val="22"/>
+              </w:rPr>
+              <w:t>Insider</w:t>
+            </w:r>
+          </w:p>
+        </w:tc>
+        <w:tc>
+          <w:tcPr>
+            <w:tcW w:type="dxa" w:w="720"/>
+            <w:vAlign w:val="center"/>
+            <w:tcBorders>
+              <w:top w:val="single" w:sz="1" w:space="0" w:color="C0C0C0"/>
+              <w:bottom w:val="single" w:sz="1" w:space="0" w:color="C0C0C0"/>
+              <w:left w:val="single" w:sz="1" w:space="0" w:color="C0C0C0"/>
+              <w:right w:val="single" w:sz="1" w:space="0" w:color="C0C0C0"/>
+            </w:tcBorders>
+          </w:tcPr>
+          <w:p>
+            <w:pPr>
+              <w:jc w:val="center"/>
+            </w:pPr>
+            <w:r>
+              <w:rPr>
+                <w:rFonts w:ascii="Arial" w:hAnsi="Arial"/>
+                <w:b/>
+                <w:i w:val="0"/>
+                <w:sz w:val="22"/>
+              </w:rPr>
+              <w:t>2</w:t>
+            </w:r>
+          </w:p>
+        </w:tc>
+        <w:tc>
+          <w:tcPr>
+            <w:tcW w:type="dxa" w:w="720"/>
+            <w:vAlign w:val="center"/>
+            <w:tcBorders>
+              <w:top w:val="single" w:sz="1" w:space="0" w:color="C0C0C0"/>
+              <w:bottom w:val="single" w:sz="1" w:space="0" w:color="C0C0C0"/>
+              <w:left w:val="single" w:sz="1" w:space="0" w:color="C0C0C0"/>
+              <w:right w:val="single" w:sz="1" w:space="0" w:color="C0C0C0"/>
+            </w:tcBorders>
+          </w:tcPr>
+          <w:p>
+            <w:pPr>
+              <w:jc w:val="center"/>
+            </w:pPr>
+            <w:r>
+              <w:rPr>
+                <w:rFonts w:ascii="Arial" w:hAnsi="Arial"/>
+                <w:b w:val="0"/>
+                <w:i w:val="0"/>
+                <w:color w:val="666666"/>
+                <w:sz w:val="22"/>
+              </w:rPr>
+              <w:t>2</w:t>
+            </w:r>
+          </w:p>
+        </w:tc>
+        <w:tc>
+          <w:tcPr>
+            <w:tcW w:type="dxa" w:w="6480"/>
+            <w:tcBorders>
+              <w:top w:val="single" w:sz="1" w:space="0" w:color="C0C0C0"/>
+              <w:bottom w:val="single" w:sz="1" w:space="0" w:color="C0C0C0"/>
+              <w:left w:val="single" w:sz="1" w:space="0" w:color="C0C0C0"/>
+              <w:right w:val="single" w:sz="1" w:space="0" w:color="C0C0C0"/>
+            </w:tcBorders>
+          </w:tcPr>
+          <w:p>
+            <w:pPr>
+              <w:jc w:val="left"/>
+            </w:pPr>
+            <w:r>
+              <w:rPr>
+                <w:rFonts w:ascii="Arial" w:hAnsi="Arial"/>
+                <w:b w:val="0"/>
+                <w:i/>
+                <w:color w:val="555555"/>
+                <w:sz w:val="20"/>
+              </w:rPr>
+              <w:t>An insider at a research organization facilitated unauthorized access, resulting in sensitive data exposure.</w:t>
             </w:r>
           </w:p>
         </w:tc>
@@ -1040,7 +1155,7 @@
           <w:b w:val="0"/>
           <w:sz w:val="20"/>
         </w:rPr>
-        <w:t>Exploitation of unpatched systems (35 percent), compromised credentials (30 percent), third-party supplier compromise (20 percent), insider involvement (15 percent)</w:t>
+        <w:t>Exploitation of unpatched systems (36%), compromised credentials (30%), third-party supplier compromise (18%), insider actions (10%)</w:t>
       </w:r>
     </w:p>
     <w:p>
@@ -1100,7 +1215,7 @@
           <w:b w:val="0"/>
           <w:sz w:val="21"/>
         </w:rPr>
-        <w:t>China continues to prioritize the acquisition of advanced biotechnology, pharmaceutical research, and genomics intellectual property to support national economic and healthcare objectives.</w:t>
+        <w:t>China continues to prioritize the acquisition of intellectual property and sensitive data in the biotechnology, genomics, and pharmaceutical sectors to accelerate domestic innovation and global competitiveness.</w:t>
       </w:r>
     </w:p>
     <w:p>
@@ -1124,7 +1239,7 @@
           <w:b w:val="0"/>
           <w:sz w:val="21"/>
         </w:rPr>
-        <w:t>This quarter, China-linked actors were observed targeting healthcare, pharmaceutical, manufacturing, and academic organizations, with a focus on research data and supply chain access.</w:t>
+        <w:t>This quarter saw at least three China-linked advanced persistent threat groups targeting manufacturing, healthcare, and technology organizations, with a focus on research data and supply chain infiltration.</w:t>
       </w:r>
     </w:p>
     <w:p>
@@ -1148,7 +1263,7 @@
           <w:b w:val="0"/>
           <w:sz w:val="21"/>
         </w:rPr>
-        <w:t>The risk of loss of proprietary information and competitive advantage is significant. Regulatory and government scrutiny of China-linked supply chain relationships is increasing, which may impact business partnerships and compliance obligations.</w:t>
+        <w:t>The risk of intellectual property theft and competitive disadvantage remains high. Regulatory exposure is increasing, particularly regarding cross-border data flows and export controls. Strategic partnerships and R&amp;D initiatives may be targeted, requiring enhanced due diligence and monitoring.</w:t>
       </w:r>
     </w:p>
     <w:p>
@@ -1190,7 +1305,7 @@
           <w:b w:val="0"/>
           <w:sz w:val="21"/>
         </w:rPr>
-        <w:t>Russia maintains a mature ransomware and cybercrime ecosystem, with criminal groups often operating with implicit state approval. Russian actors are active in both direct attacks and as service providers to other threat groups.</w:t>
+        <w:t>Russia maintains a robust cybercriminal ecosystem that supports both financially motivated ransomware operations and opportunistic attacks on critical industries, including healthcare and manufacturing.</w:t>
       </w:r>
     </w:p>
     <w:p>
@@ -1214,7 +1329,7 @@
           <w:b w:val="0"/>
           <w:sz w:val="21"/>
         </w:rPr>
-        <w:t>Russian-linked ransomware and extortion groups continue to target healthcare, pharmaceutical, and manufacturing sectors, causing operational disruption and financial loss. Several high-profile incidents involved data theft and double extortion tactics.</w:t>
+        <w:t>Russian-linked actors were active in at least four major ransomware and extortion campaigns this quarter, with several targeting pharmaceutical and technology peers. Access brokers with ties to Russian groups continue to facilitate initial access for ransomware operators.</w:t>
       </w:r>
     </w:p>
     <w:p>
@@ -1238,7 +1353,7 @@
           <w:b w:val="0"/>
           <w:sz w:val="21"/>
         </w:rPr>
-        <w:t>Business continuity and brand reputation are at risk, with potential for regulatory fines due to data exposure. Insurance costs and requirements are rising in response to the persistent ransomware threat.</w:t>
+        <w:t>Business continuity and operational resilience are at risk due to the potential for disruptive attacks. Regulatory scrutiny around ransomware payments and incident reporting is intensifying, and insurance costs are rising. Peer benchmarking shows similar exposure across the sector.</w:t>
       </w:r>
     </w:p>
     <w:p>
@@ -1280,7 +1395,7 @@
           <w:b w:val="0"/>
           <w:sz w:val="21"/>
         </w:rPr>
-        <w:t>North Korea leverages cyber operations for both financial gain and intelligence collection, often targeting research, academic, and manufacturing organizations.</w:t>
+        <w:t>North Korea leverages cyber operations for both financial gain and strategic intelligence collection, often targeting research, academic, and manufacturing organizations.</w:t>
       </w:r>
     </w:p>
     <w:p>
@@ -1304,7 +1419,7 @@
           <w:b w:val="0"/>
           <w:sz w:val="21"/>
         </w:rPr>
-        <w:t>North Korea-linked actors were observed conducting campaigns against academic and manufacturing entities, seeking both financial assets and sensitive research data.</w:t>
+        <w:t>North Korea-linked groups were observed targeting academic and manufacturing entities, seeking both financial assets and proprietary research data.</w:t>
       </w:r>
     </w:p>
     <w:p>
@@ -1328,7 +1443,7 @@
           <w:b w:val="0"/>
           <w:sz w:val="21"/>
         </w:rPr>
-        <w:t>There is a risk of financial theft and loss of sensitive research, which could undermine innovation and erode trust with research partners and funders.</w:t>
+        <w:t>Financial fraud and data theft risks are elevated. There is an increased likelihood of regulatory investigations if sensitive research data is compromised. North Korea's dual-purpose operations blur the line between espionage and crime, complicating response and attribution.</w:t>
       </w:r>
     </w:p>
     <w:p>
@@ -1369,7 +1484,7 @@
           <w:b w:val="0"/>
           <w:sz w:val="21"/>
         </w:rPr>
-        <w:t>We anticipate continued escalation in ransomware and extortion activity, with increased targeting of supply chain partners and third-party vendors. Nation state actors are expected to intensify their focus on research and intellectual property, particularly in genomics and advanced manufacturing. Regulatory expectations around incident disclosure and third-party risk management will continue to rise.</w:t>
+        <w:t>We anticipate continued high levels of ransomware and extortion activity, with nation state actors expanding their focus on supply chain and third-party vectors. Regulatory pressure on incident reporting and third-party risk management will increase. Peer organizations are expected to invest more in resilience and executive-level response planning.</w:t>
       </w:r>
     </w:p>
     <w:p>
@@ -1393,7 +1508,7 @@
           <w:b w:val="0"/>
           <w:sz w:val="21"/>
         </w:rPr>
-        <w:t>Recommended initiatives include enhanced executive security awareness, comprehensive third-party risk assessments, targeted investment in operational technology security, and regular incident response exercises. Peer benchmarking and board-level reporting should be prioritized.</w:t>
+        <w:t>We recommend prioritizing third-party risk assessments, enhancing executive security awareness, and conducting scenario-based incident response exercises. Investment in supply chain security monitoring and data loss prevention should be accelerated.</w:t>
       </w:r>
     </w:p>
     <w:p>
@@ -1417,7 +1532,7 @@
           <w:b w:val="0"/>
           <w:sz w:val="21"/>
         </w:rPr>
-        <w:t>Monitor for emerging ransomware groups, changes in regulatory requirements, insider threat indicators, and vulnerabilities in key supply chain partners.</w:t>
+        <w:t>Monitor for increased access broker activity, evolving ransomware tactics, and new regulatory requirements on data protection and incident disclosure. Pay close attention to risks arising from emerging research partnerships and technology integrations.</w:t>
       </w:r>
     </w:p>
     <w:p>
@@ -1445,7 +1560,7 @@
           <w:b/>
           <w:sz w:val="21"/>
         </w:rPr>
-        <w:t>Executive AwarenessConduct tailored security briefings for executives and board members to align risk appetite and response expectations.</w:t>
+        <w:t>Executive AwarenessDeliver targeted briefings to executives on evolving nation state and ransomware threats, emphasizing business and reputational risks.</w:t>
       </w:r>
     </w:p>
     <w:p>
@@ -1459,7 +1574,7 @@
           <w:b/>
           <w:sz w:val="21"/>
         </w:rPr>
-        <w:t>Vendor Risk ReviewInitiate a comprehensive review of third-party and supply chain security controls, with a focus on high-value and high-risk partners.</w:t>
+        <w:t>Vendor Risk ReviewInitiate a comprehensive review of third-party and supply chain security controls, with a focus on critical vendors and research partners.</w:t>
       </w:r>
     </w:p>
     <w:p>
@@ -1473,7 +1588,7 @@
           <w:b/>
           <w:sz w:val="21"/>
         </w:rPr>
-        <w:t>Manufacturing SecurityInvest in security controls and monitoring for operational technology environments to prevent production disruptions.</w:t>
+        <w:t>Manufacturing SecurityEnhance operational technology and manufacturing environment security, including network segmentation and monitoring for anomalous activity.</w:t>
       </w:r>
     </w:p>
     <w:p>
@@ -1487,7 +1602,7 @@
           <w:b/>
           <w:sz w:val="21"/>
         </w:rPr>
-        <w:t>Incident ResponseSchedule regular tabletop exercises and update incident response plans to reflect current ransomware and extortion tactics.</w:t>
+        <w:t>Incident ResponseConduct board-level tabletop exercises and update incident response plans to address extortion, insider, and supply chain scenarios.</w:t>
       </w:r>
     </w:p>
     <w:p>
@@ -1501,7 +1616,7 @@
           <w:b/>
           <w:sz w:val="21"/>
         </w:rPr>
-        <w:t>Board ReportingLeverage threat intelligence and industry benchmarks to support ongoing board-level risk reporting and strategic decision making.</w:t>
+        <w:t>Board ReportingLeverage cyber threat intelligence to provide regular, business-focused updates to the board, supporting informed risk and investment decisions.</w:t>
       </w:r>
     </w:p>
     <w:p/>

</xml_diff>